<commit_message>
API 67 and update doc
</commit_message>
<xml_diff>
--- a/Data Health Management.docx
+++ b/Data Health Management.docx
@@ -4,30 +4,37 @@
   <w:body>
     <w:p>
       <w:pPr>
-        <w:spacing w:after="240"/>
+        <w:spacing w:after="80"/>
+        <w:jc w:val="center"/>
       </w:pPr>
       <w:r>
         <w:rPr>
           <w:rFonts w:ascii="Aptos Display" w:hAnsi="Aptos Display"/>
           <w:b/>
-          <w:sz w:val="48"/>
+          <w:color w:val="1F4E79"/>
+          <w:sz w:val="40"/>
         </w:rPr>
         <w:t>Data Health Management</w:t>
       </w:r>
     </w:p>
     <w:p>
       <w:pPr>
-        <w:spacing w:after="240"/>
+        <w:spacing w:after="80"/>
+        <w:jc w:val="center"/>
       </w:pPr>
       <w:r>
         <w:rPr>
           <w:b/>
-          <w:sz w:val="28"/>
+          <w:color w:val="595959"/>
+          <w:sz w:val="24"/>
         </w:rPr>
         <w:t>Configure Salesforce Duplicate Management</w:t>
       </w:r>
     </w:p>
     <w:p>
+      <w:pPr>
+        <w:spacing w:after="80"/>
+      </w:pPr>
       <w:r>
         <w:rPr>
           <w:b/>
@@ -41,13 +48,16 @@
     <w:p>
       <w:pPr>
         <w:pStyle w:val="Heading1"/>
-        <w:spacing w:before="200" w:after="100"/>
+        <w:spacing w:before="200" w:after="80"/>
       </w:pPr>
       <w:r>
         <w:t>Step 1 - Deploy the DHM Matching Rule Templates</w:t>
       </w:r>
     </w:p>
     <w:p>
+      <w:pPr>
+        <w:spacing w:after="80"/>
+      </w:pPr>
       <w:r>
         <w:t xml:space="preserve">The package includes </w:t>
       </w:r>
@@ -61,7 +71,7 @@
     <w:p>
       <w:pPr>
         <w:pStyle w:val="ListBullet"/>
-        <w:spacing w:after="40"/>
+        <w:spacing w:after="80"/>
       </w:pPr>
       <w:r>
         <w:t>DHM Contact Matching</w:t>
@@ -71,6 +81,9 @@
       </w:r>
     </w:p>
     <w:p>
+      <w:pPr>
+        <w:spacing w:after="80"/>
+      </w:pPr>
       <w:r>
         <w:t>Th</w:t>
       </w:r>
@@ -90,13 +103,16 @@
     <w:p>
       <w:pPr>
         <w:pStyle w:val="Heading1"/>
-        <w:spacing w:before="200" w:after="100"/>
+        <w:spacing w:before="200" w:after="80"/>
       </w:pPr>
       <w:r>
         <w:t>Step 2 - Clone and Configure the Matching Rule</w:t>
       </w:r>
     </w:p>
     <w:p>
+      <w:pPr>
+        <w:spacing w:after="80"/>
+      </w:pPr>
       <w:r>
         <w:rPr>
           <w:b/>
@@ -109,10 +125,10 @@
     </w:p>
     <w:p>
       <w:pPr>
-        <w:spacing w:after="40"/>
+        <w:spacing w:after="80"/>
       </w:pPr>
       <w:r>
-        <w:t xml:space="preserve">1.  Open the DHM </w:t>
+        <w:t xml:space="preserve">1. Open the DHM </w:t>
       </w:r>
       <w:r>
         <w:t>Contact</w:t>
@@ -123,35 +139,43 @@
     </w:p>
     <w:p>
       <w:pPr>
-        <w:spacing w:after="40"/>
+        <w:spacing w:after="80"/>
       </w:pPr>
       <w:r>
-        <w:t>2.  Give the clone an organization-specific name.</w:t>
+        <w:t>2. Give the clone an organization-specific name.</w:t>
       </w:r>
     </w:p>
     <w:p>
       <w:pPr>
-        <w:spacing w:after="40"/>
+        <w:spacing w:after="80"/>
       </w:pPr>
       <w:r>
-        <w:t>3.  Adjust the matching criteria if needed.</w:t>
+        <w:t>3. Adjust the matching criteria if needed.</w:t>
       </w:r>
     </w:p>
     <w:p>
       <w:pPr>
-        <w:spacing w:after="40"/>
+        <w:spacing w:after="80"/>
       </w:pPr>
       <w:r>
-        <w:t>4.  Activate the cloned Matching Rule.</w:t>
+        <w:t>4. Activate the cloned Matching Rule.</w:t>
       </w:r>
     </w:p>
     <w:p>
       <w:pPr>
         <w:pStyle w:val="Heading2"/>
-        <w:spacing w:after="100"/>
+        <w:spacing w:after="80"/>
       </w:pPr>
       <w:r>
         <w:t>Recommended Contact Matching Criteria</w:t>
+      </w:r>
+    </w:p>
+    <w:p>
+      <w:pPr>
+        <w:spacing w:after="80"/>
+      </w:pPr>
+      <w:r>
+        <w:t>Recommended baseline: use First Name and Last Name in the Salesforce Matching Rule. Configure any additional required Contact fields, such as a date field, through the DHM Contact Additional Match Fields Flow input rather than hardcoding them into DHM.</w:t>
       </w:r>
     </w:p>
     <w:tbl>
@@ -159,12 +183,11 @@
         <w:tblStyle w:val="TableGrid"/>
         <w:tblW w:w="0" w:type="auto"/>
         <w:jc w:val="center"/>
-        <w:tblLayout w:type="fixed"/>
         <w:tblLook w:val="04A0" w:firstRow="1" w:lastRow="0" w:firstColumn="1" w:lastColumn="0" w:noHBand="0" w:noVBand="1"/>
       </w:tblPr>
       <w:tblGrid>
-        <w:gridCol w:w="4968"/>
-        <w:gridCol w:w="6480"/>
+        <w:gridCol w:w="4420"/>
+        <w:gridCol w:w="5840"/>
       </w:tblGrid>
       <w:tr>
         <w:trPr>
@@ -175,10 +198,10 @@
             <w:tcW w:w="4968" w:type="dxa"/>
             <w:shd w:val="clear" w:color="auto" w:fill="D9EAF7"/>
             <w:tcMar>
-              <w:top w:w="80" w:type="dxa"/>
-              <w:left w:w="100" w:type="dxa"/>
-              <w:bottom w:w="80" w:type="dxa"/>
-              <w:right w:w="100" w:type="dxa"/>
+              <w:top w:w="90" w:type="dxa"/>
+              <w:left w:w="90" w:type="dxa"/>
+              <w:bottom w:w="90" w:type="dxa"/>
+              <w:right w:w="90" w:type="dxa"/>
             </w:tcMar>
             <w:vAlign w:val="center"/>
           </w:tcPr>
@@ -196,10 +219,10 @@
             <w:tcW w:w="4968" w:type="dxa"/>
             <w:shd w:val="clear" w:color="auto" w:fill="D9EAF7"/>
             <w:tcMar>
-              <w:top w:w="80" w:type="dxa"/>
-              <w:left w:w="100" w:type="dxa"/>
-              <w:bottom w:w="80" w:type="dxa"/>
-              <w:right w:w="100" w:type="dxa"/>
+              <w:top w:w="90" w:type="dxa"/>
+              <w:left w:w="90" w:type="dxa"/>
+              <w:bottom w:w="90" w:type="dxa"/>
+              <w:right w:w="90" w:type="dxa"/>
             </w:tcMar>
             <w:vAlign w:val="center"/>
           </w:tcPr>
@@ -221,10 +244,10 @@
           <w:tcPr>
             <w:tcW w:w="3456" w:type="dxa"/>
             <w:tcMar>
-              <w:top w:w="80" w:type="dxa"/>
-              <w:left w:w="100" w:type="dxa"/>
-              <w:bottom w:w="80" w:type="dxa"/>
-              <w:right w:w="100" w:type="dxa"/>
+              <w:top w:w="90" w:type="dxa"/>
+              <w:left w:w="90" w:type="dxa"/>
+              <w:bottom w:w="90" w:type="dxa"/>
+              <w:right w:w="90" w:type="dxa"/>
             </w:tcMar>
             <w:vAlign w:val="center"/>
           </w:tcPr>
@@ -238,10 +261,10 @@
           <w:tcPr>
             <w:tcW w:w="6480" w:type="dxa"/>
             <w:tcMar>
-              <w:top w:w="80" w:type="dxa"/>
-              <w:left w:w="100" w:type="dxa"/>
-              <w:bottom w:w="80" w:type="dxa"/>
-              <w:right w:w="100" w:type="dxa"/>
+              <w:top w:w="90" w:type="dxa"/>
+              <w:left w:w="90" w:type="dxa"/>
+              <w:bottom w:w="90" w:type="dxa"/>
+              <w:right w:w="90" w:type="dxa"/>
             </w:tcMar>
             <w:vAlign w:val="center"/>
           </w:tcPr>
@@ -260,10 +283,10 @@
           <w:tcPr>
             <w:tcW w:w="3456" w:type="dxa"/>
             <w:tcMar>
-              <w:top w:w="80" w:type="dxa"/>
-              <w:left w:w="100" w:type="dxa"/>
-              <w:bottom w:w="80" w:type="dxa"/>
-              <w:right w:w="100" w:type="dxa"/>
+              <w:top w:w="90" w:type="dxa"/>
+              <w:left w:w="90" w:type="dxa"/>
+              <w:bottom w:w="90" w:type="dxa"/>
+              <w:right w:w="90" w:type="dxa"/>
             </w:tcMar>
             <w:vAlign w:val="center"/>
           </w:tcPr>
@@ -277,49 +300,10 @@
           <w:tcPr>
             <w:tcW w:w="6480" w:type="dxa"/>
             <w:tcMar>
-              <w:top w:w="80" w:type="dxa"/>
-              <w:left w:w="100" w:type="dxa"/>
-              <w:bottom w:w="80" w:type="dxa"/>
-              <w:right w:w="100" w:type="dxa"/>
-            </w:tcMar>
-            <w:vAlign w:val="center"/>
-          </w:tcPr>
-          <w:p>
-            <w:r>
-              <w:t>Exact</w:t>
-            </w:r>
-          </w:p>
-        </w:tc>
-      </w:tr>
-      <w:tr>
-        <w:trPr>
-          <w:jc w:val="center"/>
-        </w:trPr>
-        <w:tc>
-          <w:tcPr>
-            <w:tcW w:w="3456" w:type="dxa"/>
-            <w:tcMar>
-              <w:top w:w="80" w:type="dxa"/>
-              <w:left w:w="100" w:type="dxa"/>
-              <w:bottom w:w="80" w:type="dxa"/>
-              <w:right w:w="100" w:type="dxa"/>
-            </w:tcMar>
-            <w:vAlign w:val="center"/>
-          </w:tcPr>
-          <w:p>
-            <w:r>
-              <w:t>Email</w:t>
-            </w:r>
-          </w:p>
-        </w:tc>
-        <w:tc>
-          <w:tcPr>
-            <w:tcW w:w="6480" w:type="dxa"/>
-            <w:tcMar>
-              <w:top w:w="80" w:type="dxa"/>
-              <w:left w:w="100" w:type="dxa"/>
-              <w:bottom w:w="80" w:type="dxa"/>
-              <w:right w:w="100" w:type="dxa"/>
+              <w:top w:w="90" w:type="dxa"/>
+              <w:left w:w="90" w:type="dxa"/>
+              <w:bottom w:w="90" w:type="dxa"/>
+              <w:right w:w="90" w:type="dxa"/>
             </w:tcMar>
             <w:vAlign w:val="center"/>
           </w:tcPr>
@@ -333,13 +317,13 @@
     </w:tbl>
     <w:p>
       <w:pPr>
-        <w:spacing w:after="40"/>
+        <w:spacing w:after="80"/>
       </w:pPr>
     </w:p>
     <w:p>
       <w:pPr>
         <w:pStyle w:val="Heading1"/>
-        <w:spacing w:before="200" w:after="100"/>
+        <w:spacing w:before="200" w:after="80"/>
       </w:pPr>
       <w:r>
         <w:t xml:space="preserve">Step </w:t>
@@ -352,6 +336,9 @@
       </w:r>
     </w:p>
     <w:p>
+      <w:pPr>
+        <w:spacing w:after="80"/>
+      </w:pPr>
       <w:r>
         <w:rPr>
           <w:b/>
@@ -367,12 +354,11 @@
         <w:tblStyle w:val="TableGrid"/>
         <w:tblW w:w="0" w:type="auto"/>
         <w:jc w:val="center"/>
-        <w:tblLayout w:type="fixed"/>
         <w:tblLook w:val="04A0" w:firstRow="1" w:lastRow="0" w:firstColumn="1" w:lastColumn="0" w:noHBand="0" w:noVBand="1"/>
       </w:tblPr>
       <w:tblGrid>
-        <w:gridCol w:w="4968"/>
-        <w:gridCol w:w="6480"/>
+        <w:gridCol w:w="4433"/>
+        <w:gridCol w:w="5827"/>
       </w:tblGrid>
       <w:tr>
         <w:trPr>
@@ -383,10 +369,10 @@
             <w:tcW w:w="4968" w:type="dxa"/>
             <w:shd w:val="clear" w:color="auto" w:fill="D9EAF7"/>
             <w:tcMar>
-              <w:top w:w="80" w:type="dxa"/>
-              <w:left w:w="100" w:type="dxa"/>
-              <w:bottom w:w="80" w:type="dxa"/>
-              <w:right w:w="100" w:type="dxa"/>
+              <w:top w:w="90" w:type="dxa"/>
+              <w:left w:w="90" w:type="dxa"/>
+              <w:bottom w:w="90" w:type="dxa"/>
+              <w:right w:w="90" w:type="dxa"/>
             </w:tcMar>
             <w:vAlign w:val="center"/>
           </w:tcPr>
@@ -404,10 +390,10 @@
             <w:tcW w:w="4968" w:type="dxa"/>
             <w:shd w:val="clear" w:color="auto" w:fill="D9EAF7"/>
             <w:tcMar>
-              <w:top w:w="80" w:type="dxa"/>
-              <w:left w:w="100" w:type="dxa"/>
-              <w:bottom w:w="80" w:type="dxa"/>
-              <w:right w:w="100" w:type="dxa"/>
+              <w:top w:w="90" w:type="dxa"/>
+              <w:left w:w="90" w:type="dxa"/>
+              <w:bottom w:w="90" w:type="dxa"/>
+              <w:right w:w="90" w:type="dxa"/>
             </w:tcMar>
             <w:vAlign w:val="center"/>
           </w:tcPr>
@@ -429,10 +415,10 @@
           <w:tcPr>
             <w:tcW w:w="3456" w:type="dxa"/>
             <w:tcMar>
-              <w:top w:w="80" w:type="dxa"/>
-              <w:left w:w="100" w:type="dxa"/>
-              <w:bottom w:w="80" w:type="dxa"/>
-              <w:right w:w="100" w:type="dxa"/>
+              <w:top w:w="90" w:type="dxa"/>
+              <w:left w:w="90" w:type="dxa"/>
+              <w:bottom w:w="90" w:type="dxa"/>
+              <w:right w:w="90" w:type="dxa"/>
             </w:tcMar>
             <w:vAlign w:val="center"/>
           </w:tcPr>
@@ -446,10 +432,10 @@
           <w:tcPr>
             <w:tcW w:w="6480" w:type="dxa"/>
             <w:tcMar>
-              <w:top w:w="80" w:type="dxa"/>
-              <w:left w:w="100" w:type="dxa"/>
-              <w:bottom w:w="80" w:type="dxa"/>
-              <w:right w:w="100" w:type="dxa"/>
+              <w:top w:w="90" w:type="dxa"/>
+              <w:left w:w="90" w:type="dxa"/>
+              <w:bottom w:w="90" w:type="dxa"/>
+              <w:right w:w="90" w:type="dxa"/>
             </w:tcMar>
             <w:vAlign w:val="center"/>
           </w:tcPr>
@@ -468,10 +454,10 @@
           <w:tcPr>
             <w:tcW w:w="3456" w:type="dxa"/>
             <w:tcMar>
-              <w:top w:w="80" w:type="dxa"/>
-              <w:left w:w="100" w:type="dxa"/>
-              <w:bottom w:w="80" w:type="dxa"/>
-              <w:right w:w="100" w:type="dxa"/>
+              <w:top w:w="90" w:type="dxa"/>
+              <w:left w:w="90" w:type="dxa"/>
+              <w:bottom w:w="90" w:type="dxa"/>
+              <w:right w:w="90" w:type="dxa"/>
             </w:tcMar>
             <w:vAlign w:val="center"/>
           </w:tcPr>
@@ -485,10 +471,10 @@
           <w:tcPr>
             <w:tcW w:w="6480" w:type="dxa"/>
             <w:tcMar>
-              <w:top w:w="80" w:type="dxa"/>
-              <w:left w:w="100" w:type="dxa"/>
-              <w:bottom w:w="80" w:type="dxa"/>
-              <w:right w:w="100" w:type="dxa"/>
+              <w:top w:w="90" w:type="dxa"/>
+              <w:left w:w="90" w:type="dxa"/>
+              <w:bottom w:w="90" w:type="dxa"/>
+              <w:right w:w="90" w:type="dxa"/>
             </w:tcMar>
             <w:vAlign w:val="center"/>
           </w:tcPr>
@@ -507,10 +493,10 @@
           <w:tcPr>
             <w:tcW w:w="3456" w:type="dxa"/>
             <w:tcMar>
-              <w:top w:w="80" w:type="dxa"/>
-              <w:left w:w="100" w:type="dxa"/>
-              <w:bottom w:w="80" w:type="dxa"/>
-              <w:right w:w="100" w:type="dxa"/>
+              <w:top w:w="90" w:type="dxa"/>
+              <w:left w:w="90" w:type="dxa"/>
+              <w:bottom w:w="90" w:type="dxa"/>
+              <w:right w:w="90" w:type="dxa"/>
             </w:tcMar>
             <w:vAlign w:val="center"/>
           </w:tcPr>
@@ -524,10 +510,10 @@
           <w:tcPr>
             <w:tcW w:w="6480" w:type="dxa"/>
             <w:tcMar>
-              <w:top w:w="80" w:type="dxa"/>
-              <w:left w:w="100" w:type="dxa"/>
-              <w:bottom w:w="80" w:type="dxa"/>
-              <w:right w:w="100" w:type="dxa"/>
+              <w:top w:w="90" w:type="dxa"/>
+              <w:left w:w="90" w:type="dxa"/>
+              <w:bottom w:w="90" w:type="dxa"/>
+              <w:right w:w="90" w:type="dxa"/>
             </w:tcMar>
             <w:vAlign w:val="center"/>
           </w:tcPr>
@@ -546,10 +532,10 @@
           <w:tcPr>
             <w:tcW w:w="3456" w:type="dxa"/>
             <w:tcMar>
-              <w:top w:w="80" w:type="dxa"/>
-              <w:left w:w="100" w:type="dxa"/>
-              <w:bottom w:w="80" w:type="dxa"/>
-              <w:right w:w="100" w:type="dxa"/>
+              <w:top w:w="90" w:type="dxa"/>
+              <w:left w:w="90" w:type="dxa"/>
+              <w:bottom w:w="90" w:type="dxa"/>
+              <w:right w:w="90" w:type="dxa"/>
             </w:tcMar>
             <w:vAlign w:val="center"/>
           </w:tcPr>
@@ -563,10 +549,10 @@
           <w:tcPr>
             <w:tcW w:w="6480" w:type="dxa"/>
             <w:tcMar>
-              <w:top w:w="80" w:type="dxa"/>
-              <w:left w:w="100" w:type="dxa"/>
-              <w:bottom w:w="80" w:type="dxa"/>
-              <w:right w:w="100" w:type="dxa"/>
+              <w:top w:w="90" w:type="dxa"/>
+              <w:left w:w="90" w:type="dxa"/>
+              <w:bottom w:w="90" w:type="dxa"/>
+              <w:right w:w="90" w:type="dxa"/>
             </w:tcMar>
             <w:vAlign w:val="center"/>
           </w:tcPr>
@@ -585,10 +571,10 @@
           <w:tcPr>
             <w:tcW w:w="3456" w:type="dxa"/>
             <w:tcMar>
-              <w:top w:w="80" w:type="dxa"/>
-              <w:left w:w="100" w:type="dxa"/>
-              <w:bottom w:w="80" w:type="dxa"/>
-              <w:right w:w="100" w:type="dxa"/>
+              <w:top w:w="90" w:type="dxa"/>
+              <w:left w:w="90" w:type="dxa"/>
+              <w:bottom w:w="90" w:type="dxa"/>
+              <w:right w:w="90" w:type="dxa"/>
             </w:tcMar>
             <w:vAlign w:val="center"/>
           </w:tcPr>
@@ -603,10 +589,10 @@
           <w:tcPr>
             <w:tcW w:w="6480" w:type="dxa"/>
             <w:tcMar>
-              <w:top w:w="80" w:type="dxa"/>
-              <w:left w:w="100" w:type="dxa"/>
-              <w:bottom w:w="80" w:type="dxa"/>
-              <w:right w:w="100" w:type="dxa"/>
+              <w:top w:w="90" w:type="dxa"/>
+              <w:left w:w="90" w:type="dxa"/>
+              <w:bottom w:w="90" w:type="dxa"/>
+              <w:right w:w="90" w:type="dxa"/>
             </w:tcMar>
             <w:vAlign w:val="center"/>
           </w:tcPr>
@@ -625,10 +611,10 @@
           <w:tcPr>
             <w:tcW w:w="3456" w:type="dxa"/>
             <w:tcMar>
-              <w:top w:w="80" w:type="dxa"/>
-              <w:left w:w="100" w:type="dxa"/>
-              <w:bottom w:w="80" w:type="dxa"/>
-              <w:right w:w="100" w:type="dxa"/>
+              <w:top w:w="90" w:type="dxa"/>
+              <w:left w:w="90" w:type="dxa"/>
+              <w:bottom w:w="90" w:type="dxa"/>
+              <w:right w:w="90" w:type="dxa"/>
             </w:tcMar>
             <w:vAlign w:val="center"/>
           </w:tcPr>
@@ -642,10 +628,10 @@
           <w:tcPr>
             <w:tcW w:w="6480" w:type="dxa"/>
             <w:tcMar>
-              <w:top w:w="80" w:type="dxa"/>
-              <w:left w:w="100" w:type="dxa"/>
-              <w:bottom w:w="80" w:type="dxa"/>
-              <w:right w:w="100" w:type="dxa"/>
+              <w:top w:w="90" w:type="dxa"/>
+              <w:left w:w="90" w:type="dxa"/>
+              <w:bottom w:w="90" w:type="dxa"/>
+              <w:right w:w="90" w:type="dxa"/>
             </w:tcMar>
             <w:vAlign w:val="center"/>
           </w:tcPr>
@@ -664,10 +650,10 @@
           <w:tcPr>
             <w:tcW w:w="3456" w:type="dxa"/>
             <w:tcMar>
-              <w:top w:w="80" w:type="dxa"/>
-              <w:left w:w="100" w:type="dxa"/>
-              <w:bottom w:w="80" w:type="dxa"/>
-              <w:right w:w="100" w:type="dxa"/>
+              <w:top w:w="90" w:type="dxa"/>
+              <w:left w:w="90" w:type="dxa"/>
+              <w:bottom w:w="90" w:type="dxa"/>
+              <w:right w:w="90" w:type="dxa"/>
             </w:tcMar>
             <w:vAlign w:val="center"/>
           </w:tcPr>
@@ -681,10 +667,10 @@
           <w:tcPr>
             <w:tcW w:w="6480" w:type="dxa"/>
             <w:tcMar>
-              <w:top w:w="80" w:type="dxa"/>
-              <w:left w:w="100" w:type="dxa"/>
-              <w:bottom w:w="80" w:type="dxa"/>
-              <w:right w:w="100" w:type="dxa"/>
+              <w:top w:w="90" w:type="dxa"/>
+              <w:left w:w="90" w:type="dxa"/>
+              <w:bottom w:w="90" w:type="dxa"/>
+              <w:right w:w="90" w:type="dxa"/>
             </w:tcMar>
             <w:vAlign w:val="center"/>
           </w:tcPr>
@@ -703,10 +689,10 @@
           <w:tcPr>
             <w:tcW w:w="3456" w:type="dxa"/>
             <w:tcMar>
-              <w:top w:w="80" w:type="dxa"/>
-              <w:left w:w="100" w:type="dxa"/>
-              <w:bottom w:w="80" w:type="dxa"/>
-              <w:right w:w="100" w:type="dxa"/>
+              <w:top w:w="90" w:type="dxa"/>
+              <w:left w:w="90" w:type="dxa"/>
+              <w:bottom w:w="90" w:type="dxa"/>
+              <w:right w:w="90" w:type="dxa"/>
             </w:tcMar>
             <w:vAlign w:val="center"/>
           </w:tcPr>
@@ -720,10 +706,10 @@
           <w:tcPr>
             <w:tcW w:w="6480" w:type="dxa"/>
             <w:tcMar>
-              <w:top w:w="80" w:type="dxa"/>
-              <w:left w:w="100" w:type="dxa"/>
-              <w:bottom w:w="80" w:type="dxa"/>
-              <w:right w:w="100" w:type="dxa"/>
+              <w:top w:w="90" w:type="dxa"/>
+              <w:left w:w="90" w:type="dxa"/>
+              <w:bottom w:w="90" w:type="dxa"/>
+              <w:right w:w="90" w:type="dxa"/>
             </w:tcMar>
             <w:vAlign w:val="center"/>
           </w:tcPr>
@@ -737,13 +723,13 @@
     </w:tbl>
     <w:p>
       <w:pPr>
-        <w:spacing w:after="40"/>
+        <w:spacing w:after="80"/>
       </w:pPr>
     </w:p>
     <w:p>
       <w:pPr>
         <w:pStyle w:val="Heading1"/>
-        <w:spacing w:before="200" w:after="100"/>
+        <w:spacing w:before="200" w:after="80"/>
       </w:pPr>
       <w:r>
         <w:t xml:space="preserve">Step </w:t>
@@ -757,59 +743,41 @@
     </w:p>
     <w:p>
       <w:pPr>
-        <w:spacing w:after="40"/>
+        <w:spacing w:after="80"/>
       </w:pPr>
       <w:r>
-        <w:t>1</w:t>
-      </w:r>
-      <w:r>
-        <w:t>. Verify that the cloned Contact Matching Rule is active.</w:t>
+        <w:t>1. Verify that the cloned Contact Matching Rule is active.</w:t>
       </w:r>
     </w:p>
     <w:p>
       <w:pPr>
-        <w:spacing w:after="40"/>
+        <w:spacing w:after="80"/>
       </w:pPr>
       <w:r>
-        <w:t>2</w:t>
-      </w:r>
-      <w:r>
-        <w:t>. Verify th</w:t>
-      </w:r>
-      <w:r>
-        <w:t>e</w:t>
-      </w:r>
-      <w:r>
-        <w:t xml:space="preserve"> Contact Duplicate Rule </w:t>
-      </w:r>
-      <w:r>
-        <w:t>is</w:t>
-      </w:r>
-      <w:r>
-        <w:t xml:space="preserve"> active.</w:t>
+        <w:t>2. Verify the Contact Duplicate Rule is active.</w:t>
       </w:r>
     </w:p>
     <w:p>
       <w:pPr>
-        <w:spacing w:after="40"/>
+        <w:spacing w:after="80"/>
       </w:pPr>
       <w:r>
-        <w:t>3</w:t>
-      </w:r>
-      <w:r>
-        <w:t>. Run DHM with performMerge = false before enabling automatic merges.</w:t>
+        <w:t>3. Run DHM with Perform Merge = false before enabling automatic merges.</w:t>
       </w:r>
     </w:p>
     <w:p>
       <w:pPr>
         <w:pStyle w:val="Heading1"/>
-        <w:spacing w:before="200" w:after="100"/>
+        <w:spacing w:before="200" w:after="80"/>
       </w:pPr>
       <w:r>
         <w:t>How DHM Uses Duplicate Rules</w:t>
       </w:r>
     </w:p>
     <w:p>
+      <w:pPr>
+        <w:spacing w:after="80"/>
+      </w:pPr>
       <w:r>
         <w:t>Salesforce Duplicate Rules identify potential duplicate records. DHM then applies additional merge-safety rules before executing a merge:</w:t>
       </w:r>
@@ -817,7 +785,7 @@
     <w:p>
       <w:pPr>
         <w:pStyle w:val="ListBullet"/>
-        <w:spacing w:after="40"/>
+        <w:spacing w:after="80"/>
       </w:pPr>
       <w:r>
         <w:t>All Contacts in one Account must have a matching Contact in the other Account.</w:t>
@@ -826,7 +794,7 @@
     <w:p>
       <w:pPr>
         <w:pStyle w:val="ListBullet"/>
-        <w:spacing w:after="40"/>
+        <w:spacing w:after="80"/>
       </w:pPr>
       <w:r>
         <w:t>Contact matches must be one-to-one; duplicate identities are not collapsed.</w:t>
@@ -835,7 +803,7 @@
     <w:p>
       <w:pPr>
         <w:pStyle w:val="ListBullet"/>
-        <w:spacing w:after="40"/>
+        <w:spacing w:after="80"/>
       </w:pPr>
       <w:r>
         <w:t>Accounts may have different numbers of Contacts.</w:t>
@@ -844,7 +812,7 @@
     <w:p>
       <w:pPr>
         <w:pStyle w:val="ListBullet"/>
-        <w:spacing w:after="40"/>
+        <w:spacing w:after="80"/>
       </w:pPr>
       <w:r>
         <w:t>Contacts are never merged between different Accounts.</w:t>
@@ -853,7 +821,7 @@
     <w:p>
       <w:pPr>
         <w:pStyle w:val="ListBullet"/>
-        <w:spacing w:after="40"/>
+        <w:spacing w:after="80"/>
       </w:pPr>
       <w:r>
         <w:t>Optional Contact exclusion criteria can prevent an Account merge.</w:t>
@@ -862,22 +830,33 @@
     <w:p>
       <w:pPr>
         <w:pStyle w:val="ListBullet"/>
-        <w:spacing w:after="40"/>
+        <w:spacing w:after="80"/>
       </w:pPr>
       <w:r>
-        <w:t>performMerge controls whether DHM only evaluates candidates or actually performs eligible merges.</w:t>
+        <w:t xml:space="preserve">Perform Merge controls whether DHM only evaluates candidates or </w:t>
+      </w:r>
+      <w:proofErr w:type="gramStart"/>
+      <w:r>
+        <w:t>actually performs</w:t>
+      </w:r>
+      <w:proofErr w:type="gramEnd"/>
+      <w:r>
+        <w:t xml:space="preserve"> eligible merges.</w:t>
       </w:r>
     </w:p>
     <w:p>
       <w:pPr>
         <w:pStyle w:val="Heading2"/>
-        <w:spacing w:after="100"/>
+        <w:spacing w:after="80"/>
       </w:pPr>
       <w:r>
         <w:t>Example Contact Exclusion Criteria</w:t>
       </w:r>
     </w:p>
     <w:p>
+      <w:pPr>
+        <w:spacing w:after="80"/>
+      </w:pPr>
       <w:r>
         <w:rPr>
           <w:b/>
@@ -902,6 +881,9 @@
       </w:r>
     </w:p>
     <w:p>
+      <w:pPr>
+        <w:spacing w:after="80"/>
+      </w:pPr>
       <w:r>
         <w:t>With this exclusion configured, DHM skips an Account merge when any Contact in either Account matches the exclusion criteria.</w:t>
       </w:r>
@@ -910,19 +892,25 @@
       <w:pPr>
         <w:pStyle w:val="Heading1"/>
         <w:pageBreakBefore/>
+        <w:spacing w:before="200" w:after="80"/>
       </w:pPr>
       <w:r>
-        <w:t>Controlled Testing with maxMerges</w:t>
+        <w:lastRenderedPageBreak/>
+        <w:t>Controlled Testing with Maximum Merges</w:t>
       </w:r>
     </w:p>
     <w:p>
+      <w:pPr>
+        <w:spacing w:after="80"/>
+      </w:pPr>
       <w:r>
-        <w:t>DHM provides an optional Maximum Merges (maxMerges) Flow input for controlled testing. It limits how many eligible merges DHM will evaluate or execute during a batch run.</w:t>
+        <w:t>DHM provides an optional Maximum Merges Flow input for controlled testing. It limits how many eligible merges DHM will evaluate or execute during a batch run.</w:t>
       </w:r>
     </w:p>
     <w:p>
       <w:pPr>
         <w:pStyle w:val="Heading2"/>
+        <w:spacing w:after="80"/>
       </w:pPr>
       <w:r>
         <w:t>Recommended test sequence:</w:t>
@@ -931,38 +919,51 @@
     <w:p>
       <w:pPr>
         <w:pStyle w:val="ListNumber"/>
+        <w:spacing w:after="80"/>
       </w:pPr>
       <w:r>
-        <w:t>Set performMerge = false and maxMerges = 1. DHM stops evaluating new records after the first eligible merge is discovered.</w:t>
+        <w:t>Set Perform Merge = false and Maximum Merges = 1. DHM stops evaluating new records after the first eligible merge is discovered.</w:t>
       </w:r>
     </w:p>
     <w:p>
       <w:pPr>
         <w:pStyle w:val="ListNumber"/>
+        <w:spacing w:after="80"/>
       </w:pPr>
       <w:r>
-        <w:t>Review Duplicate_Check_Candidate__c and Duplicate_Check_Error__c to confirm the proposed merge is correct.</w:t>
+        <w:t>Review Duplicate_Check_</w:t>
+      </w:r>
+      <w:proofErr w:type="gramStart"/>
+      <w:r>
+        <w:t>Candidate__</w:t>
+      </w:r>
+      <w:proofErr w:type="gramEnd"/>
+      <w:r>
+        <w:t>c and Duplicate_Check_Error__c to confirm the proposed merge is correct.</w:t>
       </w:r>
     </w:p>
     <w:p>
       <w:pPr>
         <w:pStyle w:val="ListNumber"/>
+        <w:spacing w:after="80"/>
       </w:pPr>
       <w:r>
-        <w:t>Set performMerge = true and keep maxMerges = 1. DHM performs one eligible merge, then stops evaluating new records.</w:t>
+        <w:t>Set Perform Merge = true and keep Maximum Merges = 1. DHM performs one eligible merge, then stops evaluating new records.</w:t>
       </w:r>
     </w:p>
     <w:p>
       <w:pPr>
         <w:pStyle w:val="ListNumber"/>
+        <w:spacing w:after="80"/>
       </w:pPr>
       <w:r>
-        <w:t>After validation, leave maxMerges blank (or set it to 0) to remove the limit.</w:t>
+        <w:t>After validation, leave Maximum Merges blank (or set it to 0) to remove the limit.</w:t>
       </w:r>
     </w:p>
     <w:p>
       <w:pPr>
         <w:pStyle w:val="Heading2"/>
+        <w:spacing w:after="80"/>
       </w:pPr>
       <w:r>
         <w:t>Behavior</w:t>
@@ -971,6 +972,7 @@
     <w:p>
       <w:pPr>
         <w:pStyle w:val="ListBullet"/>
+        <w:spacing w:after="80"/>
       </w:pPr>
       <w:r>
         <w:t>Blank, null, 0, or a negative value means no maximum.</w:t>
@@ -979,22 +981,33 @@
     <w:p>
       <w:pPr>
         <w:pStyle w:val="ListBullet"/>
+        <w:spacing w:after="80"/>
       </w:pPr>
       <w:r>
-        <w:t>With performMerge = false, the limit counts eligible merges that would occur.</w:t>
+        <w:t>With Perform Merge = false, the limit counts eligible merges that would occur.</w:t>
       </w:r>
     </w:p>
     <w:p>
       <w:pPr>
         <w:pStyle w:val="ListBullet"/>
+        <w:spacing w:after="80"/>
       </w:pPr>
       <w:r>
-        <w:t>With performMerge = true, the limit counts merges only after the merge service reports that the merge completed.</w:t>
+        <w:t xml:space="preserve">With Perform Merge = true, the limit counts merges only after the merge service reports that the </w:t>
+      </w:r>
+      <w:proofErr w:type="gramStart"/>
+      <w:r>
+        <w:t>merge</w:t>
+      </w:r>
+      <w:proofErr w:type="gramEnd"/>
+      <w:r>
+        <w:t xml:space="preserve"> completed.</w:t>
       </w:r>
     </w:p>
     <w:p>
       <w:pPr>
         <w:pStyle w:val="ListBullet"/>
+        <w:spacing w:after="80"/>
       </w:pPr>
       <w:r>
         <w:t>The limit applies to both Account and Contact batch runs.</w:t>
@@ -1003,7 +1016,408 @@
     <w:p>
       <w:pPr>
         <w:pStyle w:val="Heading1"/>
-        <w:spacing w:before="200" w:after="100"/>
+        <w:pageBreakBefore/>
+        <w:spacing w:before="200" w:after="80"/>
+      </w:pPr>
+      <w:r>
+        <w:lastRenderedPageBreak/>
+        <w:t>Current DHM Flow Inputs</w:t>
+      </w:r>
+    </w:p>
+    <w:p>
+      <w:pPr>
+        <w:spacing w:after="80"/>
+      </w:pPr>
+      <w:r>
+        <w:t>The Apex action exposes the following user-facing Flow input labels. The underlying Apex variable names remain stable so existing Flow mappings can be maintained.</w:t>
+      </w:r>
+    </w:p>
+    <w:tbl>
+      <w:tblPr>
+        <w:tblStyle w:val="TableGrid"/>
+        <w:tblW w:w="0" w:type="auto"/>
+        <w:jc w:val="center"/>
+        <w:tblLook w:val="04A0" w:firstRow="1" w:lastRow="0" w:firstColumn="1" w:lastColumn="0" w:noHBand="0" w:noVBand="1"/>
+      </w:tblPr>
+      <w:tblGrid>
+        <w:gridCol w:w="4968"/>
+        <w:gridCol w:w="4968"/>
+      </w:tblGrid>
+      <w:tr>
+        <w:trPr>
+          <w:jc w:val="center"/>
+        </w:trPr>
+        <w:tc>
+          <w:tcPr>
+            <w:tcW w:w="4968" w:type="dxa"/>
+            <w:tcMar>
+              <w:top w:w="90" w:type="dxa"/>
+              <w:left w:w="90" w:type="dxa"/>
+              <w:bottom w:w="90" w:type="dxa"/>
+              <w:right w:w="90" w:type="dxa"/>
+            </w:tcMar>
+            <w:vAlign w:val="center"/>
+          </w:tcPr>
+          <w:p>
+            <w:r>
+              <w:rPr>
+                <w:b/>
+              </w:rPr>
+              <w:t>Flow Input</w:t>
+            </w:r>
+          </w:p>
+        </w:tc>
+        <w:tc>
+          <w:tcPr>
+            <w:tcW w:w="4968" w:type="dxa"/>
+            <w:tcMar>
+              <w:top w:w="90" w:type="dxa"/>
+              <w:left w:w="90" w:type="dxa"/>
+              <w:bottom w:w="90" w:type="dxa"/>
+              <w:right w:w="90" w:type="dxa"/>
+            </w:tcMar>
+            <w:vAlign w:val="center"/>
+          </w:tcPr>
+          <w:p>
+            <w:r>
+              <w:rPr>
+                <w:b/>
+              </w:rPr>
+              <w:t>Purpose</w:t>
+            </w:r>
+          </w:p>
+        </w:tc>
+      </w:tr>
+      <w:tr>
+        <w:trPr>
+          <w:jc w:val="center"/>
+        </w:trPr>
+        <w:tc>
+          <w:tcPr>
+            <w:tcW w:w="4968" w:type="dxa"/>
+            <w:tcMar>
+              <w:top w:w="90" w:type="dxa"/>
+              <w:left w:w="90" w:type="dxa"/>
+              <w:bottom w:w="90" w:type="dxa"/>
+              <w:right w:w="90" w:type="dxa"/>
+            </w:tcMar>
+            <w:vAlign w:val="center"/>
+          </w:tcPr>
+          <w:p>
+            <w:r>
+              <w:t>Source Object Type</w:t>
+            </w:r>
+          </w:p>
+        </w:tc>
+        <w:tc>
+          <w:tcPr>
+            <w:tcW w:w="4968" w:type="dxa"/>
+            <w:tcMar>
+              <w:top w:w="90" w:type="dxa"/>
+              <w:left w:w="90" w:type="dxa"/>
+              <w:bottom w:w="90" w:type="dxa"/>
+              <w:right w:w="90" w:type="dxa"/>
+            </w:tcMar>
+            <w:vAlign w:val="center"/>
+          </w:tcPr>
+          <w:p>
+            <w:r>
+              <w:t xml:space="preserve">Account or </w:t>
+            </w:r>
+            <w:proofErr w:type="gramStart"/>
+            <w:r>
+              <w:t>Contact</w:t>
+            </w:r>
+            <w:proofErr w:type="gramEnd"/>
+            <w:r>
+              <w:t>. Identifies the type of source record being evaluated.</w:t>
+            </w:r>
+          </w:p>
+        </w:tc>
+      </w:tr>
+      <w:tr>
+        <w:trPr>
+          <w:jc w:val="center"/>
+        </w:trPr>
+        <w:tc>
+          <w:tcPr>
+            <w:tcW w:w="4968" w:type="dxa"/>
+            <w:tcMar>
+              <w:top w:w="90" w:type="dxa"/>
+              <w:left w:w="90" w:type="dxa"/>
+              <w:bottom w:w="90" w:type="dxa"/>
+              <w:right w:w="90" w:type="dxa"/>
+            </w:tcMar>
+            <w:vAlign w:val="center"/>
+          </w:tcPr>
+          <w:p>
+            <w:r>
+              <w:t>Source Record Id</w:t>
+            </w:r>
+          </w:p>
+        </w:tc>
+        <w:tc>
+          <w:tcPr>
+            <w:tcW w:w="4968" w:type="dxa"/>
+            <w:tcMar>
+              <w:top w:w="90" w:type="dxa"/>
+              <w:left w:w="90" w:type="dxa"/>
+              <w:bottom w:w="90" w:type="dxa"/>
+              <w:right w:w="90" w:type="dxa"/>
+            </w:tcMar>
+            <w:vAlign w:val="center"/>
+          </w:tcPr>
+          <w:p>
+            <w:r>
+              <w:t>Optional. For controlled testing, pass the triggering Account or Contact Id (for example, $Record.Id). Leave blank for a production scheduler that should process the full eligible population.</w:t>
+            </w:r>
+          </w:p>
+        </w:tc>
+      </w:tr>
+      <w:tr>
+        <w:trPr>
+          <w:jc w:val="center"/>
+        </w:trPr>
+        <w:tc>
+          <w:tcPr>
+            <w:tcW w:w="4968" w:type="dxa"/>
+            <w:tcMar>
+              <w:top w:w="90" w:type="dxa"/>
+              <w:left w:w="90" w:type="dxa"/>
+              <w:bottom w:w="90" w:type="dxa"/>
+              <w:right w:w="90" w:type="dxa"/>
+            </w:tcMar>
+            <w:vAlign w:val="center"/>
+          </w:tcPr>
+          <w:p>
+            <w:r>
+              <w:t>Perform Merge</w:t>
+            </w:r>
+          </w:p>
+        </w:tc>
+        <w:tc>
+          <w:tcPr>
+            <w:tcW w:w="4968" w:type="dxa"/>
+            <w:tcMar>
+              <w:top w:w="90" w:type="dxa"/>
+              <w:left w:w="90" w:type="dxa"/>
+              <w:bottom w:w="90" w:type="dxa"/>
+              <w:right w:w="90" w:type="dxa"/>
+            </w:tcMar>
+            <w:vAlign w:val="center"/>
+          </w:tcPr>
+          <w:p>
+            <w:r>
+              <w:t>False = evaluate only; True = perform eligible merges.</w:t>
+            </w:r>
+          </w:p>
+        </w:tc>
+      </w:tr>
+      <w:tr>
+        <w:trPr>
+          <w:jc w:val="center"/>
+        </w:trPr>
+        <w:tc>
+          <w:tcPr>
+            <w:tcW w:w="4968" w:type="dxa"/>
+            <w:tcMar>
+              <w:top w:w="90" w:type="dxa"/>
+              <w:left w:w="90" w:type="dxa"/>
+              <w:bottom w:w="90" w:type="dxa"/>
+              <w:right w:w="90" w:type="dxa"/>
+            </w:tcMar>
+            <w:vAlign w:val="center"/>
+          </w:tcPr>
+          <w:p>
+            <w:r>
+              <w:t>Contact Additional Match Fields</w:t>
+            </w:r>
+          </w:p>
+        </w:tc>
+        <w:tc>
+          <w:tcPr>
+            <w:tcW w:w="4968" w:type="dxa"/>
+            <w:tcMar>
+              <w:top w:w="90" w:type="dxa"/>
+              <w:left w:w="90" w:type="dxa"/>
+              <w:bottom w:w="90" w:type="dxa"/>
+              <w:right w:w="90" w:type="dxa"/>
+            </w:tcMar>
+            <w:vAlign w:val="center"/>
+          </w:tcPr>
+          <w:p>
+            <w:r>
+              <w:t>Optional comma-separated Contact field API names. Only fields listed here are required as additional match criteria. DHM validates field population by Salesforce field type (text must be nonblank; other typed fields must be non-null) and requires configured values to match before a candidate is eligible.</w:t>
+            </w:r>
+          </w:p>
+        </w:tc>
+      </w:tr>
+      <w:tr>
+        <w:trPr>
+          <w:jc w:val="center"/>
+        </w:trPr>
+        <w:tc>
+          <w:tcPr>
+            <w:tcW w:w="4968" w:type="dxa"/>
+            <w:tcMar>
+              <w:top w:w="90" w:type="dxa"/>
+              <w:left w:w="90" w:type="dxa"/>
+              <w:bottom w:w="90" w:type="dxa"/>
+              <w:right w:w="90" w:type="dxa"/>
+            </w:tcMar>
+            <w:vAlign w:val="center"/>
+          </w:tcPr>
+          <w:p>
+            <w:r>
+              <w:t>Contact Exclusion Criteria</w:t>
+            </w:r>
+          </w:p>
+        </w:tc>
+        <w:tc>
+          <w:tcPr>
+            <w:tcW w:w="4968" w:type="dxa"/>
+            <w:tcMar>
+              <w:top w:w="90" w:type="dxa"/>
+              <w:left w:w="90" w:type="dxa"/>
+              <w:bottom w:w="90" w:type="dxa"/>
+              <w:right w:w="90" w:type="dxa"/>
+            </w:tcMar>
+            <w:vAlign w:val="center"/>
+          </w:tcPr>
+          <w:p>
+            <w:r>
+              <w:t>Optional Contact criteria used to prevent Account/household merges when a Contact in either Account meets the exclusion.</w:t>
+            </w:r>
+          </w:p>
+        </w:tc>
+      </w:tr>
+      <w:tr>
+        <w:trPr>
+          <w:jc w:val="center"/>
+        </w:trPr>
+        <w:tc>
+          <w:tcPr>
+            <w:tcW w:w="4968" w:type="dxa"/>
+            <w:tcMar>
+              <w:top w:w="90" w:type="dxa"/>
+              <w:left w:w="90" w:type="dxa"/>
+              <w:bottom w:w="90" w:type="dxa"/>
+              <w:right w:w="90" w:type="dxa"/>
+            </w:tcMar>
+            <w:vAlign w:val="center"/>
+          </w:tcPr>
+          <w:p>
+            <w:r>
+              <w:t>Maximum Merges</w:t>
+            </w:r>
+          </w:p>
+        </w:tc>
+        <w:tc>
+          <w:tcPr>
+            <w:tcW w:w="4968" w:type="dxa"/>
+            <w:tcMar>
+              <w:top w:w="90" w:type="dxa"/>
+              <w:left w:w="90" w:type="dxa"/>
+              <w:bottom w:w="90" w:type="dxa"/>
+              <w:right w:w="90" w:type="dxa"/>
+            </w:tcMar>
+            <w:vAlign w:val="center"/>
+          </w:tcPr>
+          <w:p>
+            <w:r>
+              <w:t>Optional test safeguard. Blank, null, 0, or a negative value means no maximum.</w:t>
+            </w:r>
+          </w:p>
+        </w:tc>
+      </w:tr>
+    </w:tbl>
+    <w:p>
+      <w:pPr>
+        <w:pStyle w:val="Heading2"/>
+        <w:spacing w:after="80"/>
+      </w:pPr>
+      <w:r>
+        <w:t>Contact Additional Match Fields</w:t>
+      </w:r>
+    </w:p>
+    <w:p>
+      <w:pPr>
+        <w:spacing w:after="80"/>
+      </w:pPr>
+      <w:r>
+        <w:t>This input is Contact-specific even during Account merging because Account eligibility is determined by comparing the Contacts in the two Accounts. A field is required only when it is included in this comma-separated list. For example, if Birthdate is included, a Contact with a null Birthdate is skipped before duplicate-rule evaluation; if Birthdate is not included, DHM does not require it.</w:t>
+      </w:r>
+    </w:p>
+    <w:p>
+      <w:pPr>
+        <w:spacing w:after="80"/>
+      </w:pPr>
+      <w:r>
+        <w:t>Do not duplicate this requirement in Contact Exclusion Criteria. Additional Match Fields define identity validation; Contact Exclusion Criteria define business conditions that should prevent an Account merge.</w:t>
+      </w:r>
+    </w:p>
+    <w:p>
+      <w:pPr>
+        <w:pStyle w:val="Heading1"/>
+        <w:spacing w:before="200" w:after="80"/>
+      </w:pPr>
+      <w:r>
+        <w:t>Add Merge History to Account and Contact Page Layouts</w:t>
+      </w:r>
+    </w:p>
+    <w:p>
+      <w:pPr>
+        <w:spacing w:after="80"/>
+      </w:pPr>
+      <w:r>
+        <w:t>Add the Related List - Merge History to the Account and Contact page layouts used by the people who will review DHM results. This gives authorized users a convenient place to review merge history after automatic or controlled test merges.</w:t>
+      </w:r>
+    </w:p>
+    <w:p>
+      <w:pPr>
+        <w:spacing w:after="80"/>
+      </w:pPr>
+      <w:r>
+        <w:t>1. In Setup, open Object Manager &gt; Account &gt; Page Layouts.</w:t>
+      </w:r>
+    </w:p>
+    <w:p>
+      <w:pPr>
+        <w:spacing w:after="80"/>
+      </w:pPr>
+      <w:r>
+        <w:t>2. Edit each Account page layout assigned to users who should review merge history.</w:t>
+      </w:r>
+    </w:p>
+    <w:p>
+      <w:pPr>
+        <w:spacing w:after="80"/>
+      </w:pPr>
+      <w:r>
+        <w:lastRenderedPageBreak/>
+        <w:t>3. In Related Lists, add Merge History to the layout and save.</w:t>
+      </w:r>
+    </w:p>
+    <w:p>
+      <w:pPr>
+        <w:spacing w:after="80"/>
+      </w:pPr>
+      <w:r>
+        <w:t>4. Repeat the same steps under Object Manager &gt; Contact &gt; Page Layouts.</w:t>
+      </w:r>
+    </w:p>
+    <w:p>
+      <w:pPr>
+        <w:spacing w:after="80"/>
+      </w:pPr>
+      <w:r>
+        <w:t>5. Confirm the updated page layouts are assigned to the appropriate profiles/record types and that intended users can see the Merge History related list.</w:t>
+      </w:r>
+    </w:p>
+    <w:p>
+      <w:pPr>
+        <w:pStyle w:val="Heading1"/>
+        <w:spacing w:before="200" w:after="80"/>
       </w:pPr>
       <w:r>
         <w:t>Recommended Deployment Sequence</w:t>
@@ -1011,7 +1425,7 @@
     </w:p>
     <w:p>
       <w:pPr>
-        <w:spacing w:after="40"/>
+        <w:spacing w:after="80"/>
       </w:pPr>
       <w:r>
         <w:t>1. Deploy the DHM package.</w:t>
@@ -1019,7 +1433,7 @@
     </w:p>
     <w:p>
       <w:pPr>
-        <w:spacing w:after="40"/>
+        <w:spacing w:after="80"/>
       </w:pPr>
       <w:r>
         <w:t>2. Clone and activate the DHM Matching Rule template.</w:t>
@@ -1027,84 +1441,48 @@
     </w:p>
     <w:p>
       <w:pPr>
-        <w:spacing w:after="40"/>
+        <w:spacing w:after="80"/>
       </w:pPr>
       <w:r>
-        <w:t>3</w:t>
-      </w:r>
-      <w:r>
-        <w:t>. Create and activate the Contact Duplicate Rule.</w:t>
+        <w:t>3. Create and activate the Contact Duplicate Rule.</w:t>
       </w:r>
     </w:p>
     <w:p>
       <w:pPr>
-        <w:spacing w:after="40"/>
+        <w:spacing w:after="80"/>
       </w:pPr>
       <w:r>
-        <w:t>4</w:t>
-      </w:r>
-      <w:r>
-        <w:t xml:space="preserve">. Run DHM with </w:t>
-      </w:r>
-      <w:proofErr w:type="spellStart"/>
-      <w:r>
-        <w:t>performMerge</w:t>
-      </w:r>
-      <w:proofErr w:type="spellEnd"/>
-      <w:r>
-        <w:t xml:space="preserve"> = false to validate candidate detection.</w:t>
+        <w:t>4. Run DHM with Perform Merge = false to validate candidate detection.</w:t>
       </w:r>
     </w:p>
     <w:p>
       <w:pPr>
-        <w:spacing w:after="40"/>
+        <w:spacing w:after="80"/>
       </w:pPr>
       <w:r>
-        <w:t>5</w:t>
-      </w:r>
-      <w:r>
-        <w:t xml:space="preserve">. Review </w:t>
-      </w:r>
-      <w:proofErr w:type="spellStart"/>
-      <w:r>
-        <w:t>Duplicate_Check_Candidate__c</w:t>
-      </w:r>
-      <w:proofErr w:type="spellEnd"/>
-      <w:r>
-        <w:t xml:space="preserve"> and </w:t>
-      </w:r>
-      <w:proofErr w:type="spellStart"/>
-      <w:r>
-        <w:t>Duplicate_Check_Error__c</w:t>
-      </w:r>
-      <w:proofErr w:type="spellEnd"/>
-      <w:r>
-        <w:t>.</w:t>
+        <w:t>5. Review Duplicate_Check_Candidate__c and Duplicate_Check_Error__c.</w:t>
       </w:r>
     </w:p>
     <w:p>
       <w:pPr>
-        <w:spacing w:after="40"/>
+        <w:spacing w:after="80"/>
       </w:pPr>
       <w:r>
-        <w:t>6</w:t>
-      </w:r>
-      <w:r>
-        <w:t xml:space="preserve">. After validation, set </w:t>
-      </w:r>
-      <w:proofErr w:type="spellStart"/>
-      <w:r>
-        <w:t>performMerge</w:t>
-      </w:r>
-      <w:proofErr w:type="spellEnd"/>
-      <w:r>
-        <w:t xml:space="preserve"> = true to enable eligible automatic merges.</w:t>
+        <w:t>6. Add the Merge History related list to the Account and Contact page layouts used by merge-review users.</w:t>
       </w:r>
     </w:p>
     <w:p>
       <w:pPr>
+        <w:spacing w:after="80"/>
+      </w:pPr>
+      <w:r>
+        <w:t>7. After validation, set Perform Merge = true to enable eligible automatic merges.</w:t>
+      </w:r>
+    </w:p>
+    <w:p>
+      <w:pPr>
         <w:pStyle w:val="Heading1"/>
-        <w:spacing w:before="200" w:after="100"/>
+        <w:spacing w:before="200" w:after="80"/>
       </w:pPr>
       <w:r>
         <w:t xml:space="preserve">Why DHM Does Not Package </w:t>
@@ -1117,13 +1495,18 @@
       </w:r>
     </w:p>
     <w:p>
+      <w:pPr>
+        <w:spacing w:after="80"/>
+      </w:pPr>
       <w:r>
         <w:t>Salesforce Duplicate Rules are organization-specific configuration. They control actions such as Allow, Alert, or Block, activation state, sharing behavior, and rule execution order. Those settings can vary between organizations and can conflict with existing Duplicate Rules during metadata deployment.</w:t>
       </w:r>
     </w:p>
     <w:p>
+      <w:pPr>
+        <w:spacing w:after="80"/>
+      </w:pPr>
       <w:r>
-        <w:lastRenderedPageBreak/>
         <w:t xml:space="preserve">To avoid overwriting customer configuration, DHM provides </w:t>
       </w:r>
       <w:r>
@@ -1136,7 +1519,7 @@
     <w:sectPr>
       <w:footerReference w:type="default" r:id="rId8"/>
       <w:pgSz w:w="12240" w:h="15840"/>
-      <w:pgMar w:top="1008" w:right="1152" w:bottom="1008" w:left="1152" w:header="720" w:footer="720" w:gutter="0"/>
+      <w:pgMar w:top="1008" w:right="1080" w:bottom="1008" w:left="1080" w:header="720" w:footer="720" w:gutter="0"/>
       <w:cols w:space="720"/>
       <w:docGrid w:linePitch="360"/>
     </w:sectPr>

</xml_diff>

<commit_message>
prevent duplicate run, add short-circuit for max merges reached
</commit_message>
<xml_diff>
--- a/Data Health Management.docx
+++ b/Data Health Management.docx
@@ -48,6 +48,7 @@
     <w:p>
       <w:pPr>
         <w:pStyle w:val="Heading1"/>
+        <w:keepNext/>
         <w:spacing w:before="200" w:after="80"/>
       </w:pPr>
       <w:r>
@@ -103,6 +104,7 @@
     <w:p>
       <w:pPr>
         <w:pStyle w:val="Heading1"/>
+        <w:keepNext/>
         <w:spacing w:before="200" w:after="80"/>
       </w:pPr>
       <w:r>
@@ -164,6 +166,7 @@
     <w:p>
       <w:pPr>
         <w:pStyle w:val="Heading2"/>
+        <w:keepNext/>
         <w:spacing w:after="80"/>
       </w:pPr>
       <w:r>
@@ -323,6 +326,7 @@
     <w:p>
       <w:pPr>
         <w:pStyle w:val="Heading1"/>
+        <w:keepNext/>
         <w:spacing w:before="200" w:after="80"/>
       </w:pPr>
       <w:r>
@@ -729,6 +733,7 @@
     <w:p>
       <w:pPr>
         <w:pStyle w:val="Heading1"/>
+        <w:keepNext/>
         <w:spacing w:before="200" w:after="80"/>
       </w:pPr>
       <w:r>
@@ -768,6 +773,7 @@
     <w:p>
       <w:pPr>
         <w:pStyle w:val="Heading1"/>
+        <w:keepNext/>
         <w:spacing w:before="200" w:after="80"/>
       </w:pPr>
       <w:r>
@@ -847,6 +853,7 @@
     <w:p>
       <w:pPr>
         <w:pStyle w:val="Heading2"/>
+        <w:keepNext/>
         <w:spacing w:after="80"/>
       </w:pPr>
       <w:r>
@@ -891,6 +898,7 @@
     <w:p>
       <w:pPr>
         <w:pStyle w:val="Heading1"/>
+        <w:keepNext/>
         <w:pageBreakBefore/>
         <w:spacing w:before="200" w:after="80"/>
       </w:pPr>
@@ -910,6 +918,7 @@
     <w:p>
       <w:pPr>
         <w:pStyle w:val="Heading2"/>
+        <w:keepNext/>
         <w:spacing w:after="80"/>
       </w:pPr>
       <w:r>
@@ -963,6 +972,7 @@
     <w:p>
       <w:pPr>
         <w:pStyle w:val="Heading2"/>
+        <w:keepNext/>
         <w:spacing w:after="80"/>
       </w:pPr>
       <w:r>
@@ -1016,6 +1026,7 @@
     <w:p>
       <w:pPr>
         <w:pStyle w:val="Heading1"/>
+        <w:keepNext/>
         <w:pageBreakBefore/>
         <w:spacing w:before="200" w:after="80"/>
       </w:pPr>
@@ -1334,6 +1345,7 @@
     <w:p>
       <w:pPr>
         <w:pStyle w:val="Heading2"/>
+        <w:keepNext/>
         <w:spacing w:after="80"/>
       </w:pPr>
       <w:r>
@@ -1359,6 +1371,7 @@
     <w:p>
       <w:pPr>
         <w:pStyle w:val="Heading1"/>
+        <w:keepNext/>
         <w:spacing w:before="200" w:after="80"/>
       </w:pPr>
       <w:r>
@@ -1417,6 +1430,248 @@
     <w:p>
       <w:pPr>
         <w:pStyle w:val="Heading1"/>
+        <w:keepNext/>
+      </w:pPr>
+      <w:r>
+        <w:t>Schedule DHM Account and Contact Management</w:t>
+      </w:r>
+    </w:p>
+    <w:p>
+      <w:pPr/>
+      <w:r>
+        <w:t>Production processing uses two Autolaunched Flows as the administrator-facing configuration layer and two Scheduled Apex classes as the time-based scheduler. The Scheduled Apex classes start each Flow once; the Flow then invokes the DHM Apex action and launches a single Batch Apex job for the full eligible population.</w:t>
+      </w:r>
+    </w:p>
+    <w:p>
+      <w:pPr>
+        <w:pStyle w:val="Heading2"/>
+        <w:keepNext/>
+      </w:pPr>
+      <w:r>
+        <w:t>Production Autolaunched Flows</w:t>
+      </w:r>
+    </w:p>
+    <w:p>
+      <w:pPr/>
+      <w:r>
+        <w:t>Use these Flow API names:</w:t>
+      </w:r>
+    </w:p>
+    <w:p>
+      <w:pPr>
+        <w:pStyle w:val="ListBullet"/>
+      </w:pPr>
+      <w:r>
+        <w:t>DHM_Account_Duplicate_Management - Account duplicate-management configuration</w:t>
+      </w:r>
+    </w:p>
+    <w:p>
+      <w:pPr>
+        <w:pStyle w:val="ListBullet"/>
+      </w:pPr>
+      <w:r>
+        <w:t>DHM_Contact_Duplicate_Management - Contact duplicate-management configuration</w:t>
+      </w:r>
+    </w:p>
+    <w:p>
+      <w:pPr/>
+      <w:r>
+        <w:t>The Flow record Id is not referenced by Apex. Salesforce Flow record/version Ids can change between organizations and versions; the stable Flow API name is used instead.</w:t>
+      </w:r>
+    </w:p>
+    <w:p>
+      <w:pPr/>
+      <w:r>
+        <w:t>In production, leave Source Record Id blank so the batch processes the full eligible population. Configure Source Object Type, Contact Additional Match Fields, Contact Exclusion Criteria, Maximum Merges, and Perform Merge directly on the Apex Action in each Autolaunched Flow.</w:t>
+      </w:r>
+    </w:p>
+    <w:p>
+      <w:pPr>
+        <w:pStyle w:val="Heading2"/>
+        <w:keepNext/>
+      </w:pPr>
+      <w:r>
+        <w:t>Scheduled Apex Classes</w:t>
+      </w:r>
+    </w:p>
+    <w:p>
+      <w:pPr/>
+      <w:r>
+        <w:t>The package includes DHM_AccountDuplicateScheduler and DHM_ContactDuplicateScheduler. Each scheduler starts its corresponding Autolaunched Flow. Deploying these classes does not automatically create a Salesforce schedule; schedule each class once after deployment.</w:t>
+      </w:r>
+    </w:p>
+    <w:p>
+      <w:pPr>
+        <w:pStyle w:val="Heading2"/>
+        <w:keepNext/>
+        <w:pageBreakBefore/>
+      </w:pPr>
+      <w:r>
+        <w:t>Schedule the Account Flow</w:t>
+      </w:r>
+    </w:p>
+    <w:p>
+      <w:pPr/>
+      <w:r>
+        <w:t>In Developer Console, open Debug &gt; Open Execute Anonymous Window and run the following once to schedule Account duplicate management every day at 4:00 AM:</w:t>
+      </w:r>
+    </w:p>
+    <w:tbl>
+      <w:tblPr>
+        <w:tblW w:type="auto" w:w="0"/>
+        <w:jc w:val="center"/>
+        <w:tblLayout w:type="fixed"/>
+        <w:tblLook w:firstColumn="1" w:firstRow="1" w:lastColumn="0" w:lastRow="0" w:noHBand="0" w:noVBand="1" w:val="04A0"/>
+      </w:tblPr>
+      <w:tblGrid>
+        <w:gridCol w:w="10080"/>
+      </w:tblGrid>
+      <w:tr>
+        <w:trPr>
+          <w:cantSplit/>
+        </w:trPr>
+        <w:tc>
+          <w:tcPr>
+            <w:tcW w:type="dxa" w:w="8928"/>
+            <w:vAlign w:val="center"/>
+            <w:shd w:fill="F3F5F7"/>
+            <w:tcMar>
+              <w:top w:w="100" w:type="dxa"/>
+              <w:left w:w="140" w:type="dxa"/>
+              <w:bottom w:w="100" w:type="dxa"/>
+              <w:right w:w="140" w:type="dxa"/>
+            </w:tcMar>
+            <w:tcBorders>
+              <w:top w:val="single" w:sz="4" w:color="D9DEE3"/>
+              <w:left w:val="single" w:sz="4" w:color="D9DEE3"/>
+              <w:bottom w:val="single" w:sz="4" w:color="D9DEE3"/>
+              <w:right w:val="single" w:sz="4" w:color="D9DEE3"/>
+            </w:tcBorders>
+          </w:tcPr>
+          <w:p>
+            <w:pPr>
+              <w:spacing w:before="80" w:after="80" w:line="240" w:lineRule="auto"/>
+            </w:pPr>
+            <w:r>
+              <w:rPr>
+                <w:rFonts w:ascii="Courier New" w:hAnsi="Courier New" w:eastAsia="Courier New"/>
+                <w:sz w:val="17"/>
+              </w:rPr>
+              <w:t>System.schedule(</w:t>
+              <w:br/>
+              <w:t xml:space="preserve">    'DHM Account Duplicate Management',</w:t>
+              <w:br/>
+              <w:t xml:space="preserve">    '0 0 4 * * ?',</w:t>
+              <w:br/>
+              <w:t xml:space="preserve">    new DHM_AccountDuplicateScheduler()</w:t>
+              <w:br/>
+              <w:t>);</w:t>
+            </w:r>
+          </w:p>
+        </w:tc>
+      </w:tr>
+    </w:tbl>
+    <w:p>
+      <w:pPr>
+        <w:pStyle w:val="Heading2"/>
+        <w:keepNext/>
+      </w:pPr>
+      <w:r>
+        <w:t>Schedule the Contact Flow</w:t>
+      </w:r>
+    </w:p>
+    <w:p>
+      <w:pPr/>
+      <w:r>
+        <w:t>Run the following once to schedule Contact duplicate management every day at 7:00 AM:</w:t>
+      </w:r>
+    </w:p>
+    <w:tbl>
+      <w:tblPr>
+        <w:tblW w:type="auto" w:w="0"/>
+        <w:jc w:val="center"/>
+        <w:tblLayout w:type="fixed"/>
+        <w:tblLook w:firstColumn="1" w:firstRow="1" w:lastColumn="0" w:lastRow="0" w:noHBand="0" w:noVBand="1" w:val="04A0"/>
+      </w:tblPr>
+      <w:tblGrid>
+        <w:gridCol w:w="10080"/>
+      </w:tblGrid>
+      <w:tr>
+        <w:trPr>
+          <w:cantSplit/>
+        </w:trPr>
+        <w:tc>
+          <w:tcPr>
+            <w:tcW w:type="dxa" w:w="8928"/>
+            <w:vAlign w:val="center"/>
+            <w:shd w:fill="F3F5F7"/>
+            <w:tcMar>
+              <w:top w:w="100" w:type="dxa"/>
+              <w:left w:w="140" w:type="dxa"/>
+              <w:bottom w:w="100" w:type="dxa"/>
+              <w:right w:w="140" w:type="dxa"/>
+            </w:tcMar>
+            <w:tcBorders>
+              <w:top w:val="single" w:sz="4" w:color="D9DEE3"/>
+              <w:left w:val="single" w:sz="4" w:color="D9DEE3"/>
+              <w:bottom w:val="single" w:sz="4" w:color="D9DEE3"/>
+              <w:right w:val="single" w:sz="4" w:color="D9DEE3"/>
+            </w:tcBorders>
+          </w:tcPr>
+          <w:p>
+            <w:pPr>
+              <w:spacing w:before="80" w:after="80" w:line="240" w:lineRule="auto"/>
+            </w:pPr>
+            <w:r>
+              <w:rPr>
+                <w:rFonts w:ascii="Courier New" w:hAnsi="Courier New" w:eastAsia="Courier New"/>
+                <w:sz w:val="17"/>
+              </w:rPr>
+              <w:t>System.schedule(</w:t>
+              <w:br/>
+              <w:t xml:space="preserve">    'DHM Contact Duplicate Management',</w:t>
+              <w:br/>
+              <w:t xml:space="preserve">    '0 0 7 * * ?',</w:t>
+              <w:br/>
+              <w:t xml:space="preserve">    new DHM_ContactDuplicateScheduler()</w:t>
+              <w:br/>
+              <w:t>);</w:t>
+            </w:r>
+          </w:p>
+        </w:tc>
+      </w:tr>
+    </w:tbl>
+    <w:p>
+      <w:pPr/>
+      <w:r>
+        <w:t>The example times intentionally stagger Account and Contact processing. If an earlier DHM batch is still active, the duplicate-job guard prevents another DHM duplicate-check batch from being queued. Choose times that provide enough separation for the production data volume.</w:t>
+      </w:r>
+    </w:p>
+    <w:p>
+      <w:pPr>
+        <w:pStyle w:val="Heading2"/>
+        <w:keepNext/>
+      </w:pPr>
+      <w:r>
+        <w:t>Verify or Manage the Schedule</w:t>
+      </w:r>
+    </w:p>
+    <w:p>
+      <w:pPr/>
+      <w:r>
+        <w:t>Navigate to Setup &gt; Scheduled Jobs and confirm that DHM Account Duplicate Management and DHM Contact Duplicate Management are listed with the expected next run times. The schedules remain after later Apex deployments; reschedule only when changing the run time/cadence or after deleting a scheduled job.</w:t>
+      </w:r>
+    </w:p>
+    <w:p>
+      <w:pPr/>
+      <w:r>
+        <w:t>Salesforce Setup &gt; Apex Classes &gt; Schedule Apex can also be used to create the schedules, but Execute Anonymous is recommended when an exact CRON schedule is desired.</w:t>
+      </w:r>
+    </w:p>
+    <w:p>
+      <w:pPr>
+        <w:pStyle w:val="Heading1"/>
+        <w:keepNext/>
         <w:spacing w:before="200" w:after="80"/>
       </w:pPr>
       <w:r>
@@ -1424,64 +1679,69 @@
       </w:r>
     </w:p>
     <w:p>
-      <w:pPr>
-        <w:spacing w:after="80"/>
-      </w:pPr>
+      <w:pPr/>
       <w:r>
-        <w:t>1. Deploy the DHM package.</w:t>
+        <w:t>1. Deploy the DHM package, including the batch launcher, duplicate-job guard, scheduler classes, and Autolaunched Flow metadata.</w:t>
       </w:r>
     </w:p>
     <w:p>
-      <w:pPr>
-        <w:spacing w:after="80"/>
-      </w:pPr>
+      <w:pPr/>
       <w:r>
         <w:t>2. Clone and activate the DHM Matching Rule template.</w:t>
       </w:r>
     </w:p>
     <w:p>
-      <w:pPr>
-        <w:spacing w:after="80"/>
-      </w:pPr>
+      <w:pPr/>
       <w:r>
         <w:t>3. Create and activate the Contact Duplicate Rule.</w:t>
       </w:r>
     </w:p>
     <w:p>
-      <w:pPr>
-        <w:spacing w:after="80"/>
-      </w:pPr>
+      <w:pPr/>
       <w:r>
-        <w:t>4. Run DHM with Perform Merge = false to validate candidate detection.</w:t>
+        <w:t>4. Configure DHM_Account_Duplicate_Management and DHM_Contact_Duplicate_Management. For controlled testing, use Perform Merge = false and Maximum Merges = 1.</w:t>
       </w:r>
     </w:p>
     <w:p>
-      <w:pPr>
-        <w:spacing w:after="80"/>
-      </w:pPr>
+      <w:pPr/>
       <w:r>
-        <w:t>5. Review Duplicate_Check_Candidate__c and Duplicate_Check_Error__c.</w:t>
+        <w:t>5. Run each Autolaunched Flow manually and review Duplicate_Check_Candidate__c and Duplicate_Check_Error__c.</w:t>
       </w:r>
     </w:p>
     <w:p>
-      <w:pPr>
-        <w:spacing w:after="80"/>
-      </w:pPr>
+      <w:pPr/>
       <w:r>
-        <w:t>6. Add the Merge History related list to the Account and Contact page layouts used by merge-review users.</w:t>
+        <w:t>6. Set Perform Merge = true while keeping Maximum Merges = 1 and validate one actual merge.</w:t>
       </w:r>
     </w:p>
     <w:p>
-      <w:pPr>
-        <w:spacing w:after="80"/>
-      </w:pPr>
+      <w:pPr/>
       <w:r>
-        <w:t>7. After validation, set Perform Merge = true to enable eligible automatic merges.</w:t>
+        <w:t>7. Add the Merge History related list to the Account and Contact page layouts used by merge-review users.</w:t>
       </w:r>
     </w:p>
     <w:p>
+      <w:pPr/>
+      <w:r>
+        <w:t>8. For production, leave Source Record Id blank and Maximum Merges blank (or 0) in each management Flow.</w:t>
+      </w:r>
+    </w:p>
+    <w:p>
+      <w:pPr/>
+      <w:r>
+        <w:t>9. Schedule DHM_AccountDuplicateScheduler and DHM_ContactDuplicateScheduler once, using staggered run times.</w:t>
+      </w:r>
+    </w:p>
+    <w:p>
+      <w:pPr/>
+      <w:r>
+        <w:t>10. Verify both entries in Setup &gt; Scheduled Jobs and monitor the first full production runs before adjusting the schedule or batch settings.</w:t>
+      </w:r>
+    </w:p>
+    <w:p>
       <w:pPr>
         <w:pStyle w:val="Heading1"/>
+        <w:keepNext/>
         <w:spacing w:before="200" w:after="80"/>
       </w:pPr>
       <w:r>

</xml_diff>

<commit_message>
merge not match criteria feature
</commit_message>
<xml_diff>
--- a/Data Health Management.docx
+++ b/Data Health Management.docx
@@ -794,7 +794,7 @@
         <w:spacing w:after="80"/>
       </w:pPr>
       <w:r>
-        <w:t>All Contacts in one Account must have a matching Contact in the other Account.</w:t>
+        <w:t>By default, every Contact in one Account must have a distinct matching Contact in the other Account; the other Account may contain additional Contacts.</w:t>
       </w:r>
     </w:p>
     <w:p>
@@ -812,7 +812,15 @@
         <w:spacing w:after="80"/>
       </w:pPr>
       <w:r>
-        <w:t>By default, Accounts may have different numbers of Contacts. If Account Merge Require All Matching Contacts = True, both Accounts must have the same number of Contacts.</w:t>
+        <w:t>If Account Merge Allowed Unmatched Contact Criteria is configured, Contacts that match that criteria may remain unmatched; all other Contacts on both Accounts must match one-to-one.</w:t>
+      </w:r>
+    </w:p>
+    <w:p>
+      <w:pPr>
+        <w:pStyle w:val="ListBullet"/>
+      </w:pPr>
+      <w:r>
+        <w:t>If Account Merge Require All Matching Contacts = True, both Accounts must have the same number of Contacts and every Contact must match; allowed-unmatched criteria are ignored in strict mode.</w:t>
       </w:r>
     </w:p>
     <w:p>
@@ -868,7 +876,7 @@
         <w:rPr>
           <w:b/>
         </w:rPr>
-        <w:t xml:space="preserve">Example: </w:t>
+        <w:t>Example: Do_Not_Auto_Merge__c = true (when an organization has a field representing a hard merge prohibition).</w:t>
       </w:r>
       <w:proofErr w:type="spellStart"/>
       <w:r>
@@ -876,7 +884,6 @@
           <w:rFonts w:ascii="Consolas" w:hAnsi="Consolas"/>
           <w:sz w:val="21"/>
         </w:rPr>
-        <w:t>Age__c</w:t>
       </w:r>
       <w:proofErr w:type="spellEnd"/>
       <w:r>
@@ -884,7 +891,6 @@
           <w:rFonts w:ascii="Consolas" w:hAnsi="Consolas"/>
           <w:sz w:val="21"/>
         </w:rPr>
-        <w:t xml:space="preserve"> &lt; 18</w:t>
       </w:r>
     </w:p>
     <w:p>
@@ -892,7 +898,7 @@
         <w:spacing w:after="80"/>
       </w:pPr>
       <w:r>
-        <w:t>With this exclusion configured, DHM skips an Account merge when any Contact in either Account matches the exclusion criteria.</w:t>
+        <w:t>Contact Exclusion Criteria is intended for a hard stop: when any Contact in either Account matches the configured criteria, DHM skips the Account merge. Leave it blank when no Contact condition should disqualify the household.</w:t>
       </w:r>
     </w:p>
     <w:p>
@@ -1040,7 +1046,7 @@
         <w:spacing w:after="80"/>
       </w:pPr>
       <w:r>
-        <w:t>The Apex action exposes the following user-facing Flow input labels. The underlying Apex variable names remain stable so existing Flow mappings can be maintained.</w:t>
+        <w:t>The Apex action exposes the following user-facing Flow input labels. Account-only options are ignored by Contact duplicate-management runs.</w:t>
       </w:r>
     </w:p>
     <w:tbl>
@@ -1057,6 +1063,8 @@
       <w:tr>
         <w:trPr>
           <w:jc w:val="center"/>
+          <w:cantSplit/>
+          <w:tblHeader w:val="true"/>
         </w:trPr>
         <w:tc>
           <w:tcPr>
@@ -1102,6 +1110,7 @@
       <w:tr>
         <w:trPr>
           <w:jc w:val="center"/>
+          <w:cantSplit/>
         </w:trPr>
         <w:tc>
           <w:tcPr>
@@ -1149,6 +1158,7 @@
       <w:tr>
         <w:trPr>
           <w:jc w:val="center"/>
+          <w:cantSplit/>
         </w:trPr>
         <w:tc>
           <w:tcPr>
@@ -1188,6 +1198,7 @@
       <w:tr>
         <w:trPr>
           <w:jc w:val="center"/>
+          <w:cantSplit/>
         </w:trPr>
         <w:tc>
           <w:tcPr>
@@ -1227,6 +1238,7 @@
       <w:tr>
         <w:trPr>
           <w:jc w:val="center"/>
+          <w:cantSplit/>
         </w:trPr>
         <w:tc>
           <w:tcPr>
@@ -1266,6 +1278,7 @@
       <w:tr>
         <w:trPr>
           <w:jc w:val="center"/>
+          <w:cantSplit/>
         </w:trPr>
         <w:tc>
           <w:tcPr>
@@ -1304,7 +1317,33 @@
       </w:tr>
       <w:tr>
         <w:trPr>
+          <w:cantSplit/>
+        </w:trPr>
+        <w:tc>
+          <w:tcPr>
+            <w:tcW w:type="dxa" w:w="4968"/>
+          </w:tcPr>
+          <w:p>
+            <w:r>
+              <w:t>Account Merge Allowed Unmatched Contact Criteria</w:t>
+            </w:r>
+          </w:p>
+        </w:tc>
+        <w:tc>
+          <w:tcPr>
+            <w:tcW w:type="dxa" w:w="4968"/>
+          </w:tcPr>
+          <w:p>
+            <w:r>
+              <w:t>Account-only optional Contact criteria. When configured and Account Merge Require All Matching Contacts is False, Contacts matching this criteria may remain unmatched; every other Contact on both Accounts must have a distinct match. Blank preserves the existing asymmetric household behavior. Example: C501_Age_Calculate__c &lt; 18.</w:t>
+            </w:r>
+          </w:p>
+        </w:tc>
+      </w:tr>
+      <w:tr>
+        <w:trPr>
           <w:jc w:val="center"/>
+          <w:cantSplit/>
         </w:trPr>
         <w:tc>
           <w:tcPr>
@@ -1342,6 +1381,9 @@
         </w:tc>
       </w:tr>
       <w:tr>
+        <w:trPr>
+          <w:cantSplit/>
+        </w:trPr>
         <w:tc>
           <w:tcPr>
             <w:tcW w:type="dxa" w:w="4968"/>
@@ -1361,12 +1403,8 @@
             <w:tcW w:type="dxa" w:w="4968"/>
           </w:tcPr>
           <w:p>
-            <w:pPr/>
             <w:r>
-              <w:rPr>
-                <w:sz w:val="20"/>
-              </w:rPr>
-              <w:t>Account-only merge safety option. Default = False. When False, every Contact in one Account must have a distinct matching Contact in the other Account, but the other Account may contain additional Contacts. When True, both Accounts must have the same number of Contacts and every Contact must match one-to-one.</w:t>
+              <w:t>Account-only strict merge safety option. Default = False. When True, both Accounts must contain the same number of Contacts and every Contact must match one-to-one; Account Merge Allowed Unmatched Contact Criteria is ignored. When False, the allowed-unmatched criteria may optionally permit selected unmatched Contacts.</w:t>
             </w:r>
           </w:p>
         </w:tc>
@@ -1395,7 +1433,35 @@
         <w:spacing w:after="80"/>
       </w:pPr>
       <w:r>
-        <w:t>Do not duplicate this requirement in Contact Exclusion Criteria. Additional Match Fields define identity validation; Contact Exclusion Criteria define business conditions that should prevent an Account merge.</w:t>
+        <w:t>Do not duplicate identity requirements in Contact Exclusion Criteria. Contact Additional Match Fields define identity validation; Contact Exclusion Criteria define hard-stop business conditions; Account Merge Allowed Unmatched Contact Criteria defines which Contacts may be present without a counterpart.</w:t>
+      </w:r>
+    </w:p>
+    <w:p>
+      <w:pPr>
+        <w:pStyle w:val="Heading2"/>
+      </w:pPr>
+      <w:r>
+        <w:t>Account Merge Allowed Unmatched Contact Criteria</w:t>
+      </w:r>
+    </w:p>
+    <w:p>
+      <w:pPr/>
+      <w:r>
+        <w:t>This optional Account-only input allows selected Contacts to remain unmatched without preventing an otherwise safe household merge. When the input is populated, DHM evaluates both Accounts: every Contact that does not satisfy the allowed-unmatched criteria must have a distinct Contact match in the other Account. Contacts that satisfy the criteria may remain unmatched. If one of those optional Contacts also has a valid duplicate match, DHM still recognizes the pair; after the Account merge places the Contacts on the same Account, the normal Contact duplicate-management run can merge the duplicate Contacts using the NPSP-safe Contact merge worker.</w:t>
+      </w:r>
+    </w:p>
+    <w:p>
+      <w:pPr>
+        <w:pStyle w:val="Heading2"/>
+      </w:pPr>
+      <w:r>
+        <w:t>Example - allow unmatched minors</w:t>
+      </w:r>
+    </w:p>
+    <w:p>
+      <w:pPr/>
+      <w:r>
+        <w:t>For a household rule where all adults must match but additional children under 18 are allowed, configure Contact Exclusion Criteria as blank, Account Merge Allowed Unmatched Contact Criteria as C501_Age_Calculate__c &lt; 18, and Account Merge Require All Matching Contacts as False. An unmatched adult still blocks the Account merge. A Contact with an unknown age does not satisfy the under-18 criteria and therefore remains a required Contact.</w:t>
       </w:r>
     </w:p>
     <w:p>
@@ -1469,7 +1535,7 @@
     <w:p>
       <w:pPr/>
       <w:r>
-        <w:t>Account Merge Require All Matching Contacts controls how strictly the two Accounts must align by Contact count. The default is False. When False, DHM keeps the existing asymmetric behavior: every Contact in one Account must have a distinct match in the other Account, but the other Account may contain additional Contacts. When True, both Accounts must contain the same number of Contacts and all Contacts must match one-to-one. This option affects Account merge eligibility only; it does not change Contact-to-Contact merge logic.</w:t>
+        <w:t>Account Merge Require All Matching Contacts controls strict household alignment. The default is False. When False and Account Merge Allowed Unmatched Contact Criteria is blank, DHM keeps the existing asymmetric behavior: every Contact in one Account must have a distinct match in the other Account, while the other Account may contain additional Contacts. When False and allowed-unmatched criteria is populated, all Contacts on both Accounts that do not meet that criteria must match one-to-one; only Contacts meeting the criteria may remain unmatched. When True, both Accounts must contain the same number of Contacts and all Contacts must match one-to-one, regardless of allowed-unmatched criteria. This option affects Account merge eligibility only; it does not change Contact-to-Contact merge logic.</w:t>
       </w:r>
     </w:p>
     <w:p>
@@ -1586,7 +1652,7 @@
     <w:p>
       <w:pPr/>
       <w:r>
-        <w:t>In production, leave Source Record Id blank so the batch processes the full eligible population. Configure Source Object Type, Contact Additional Match Fields, Contact Exclusion Criteria, Account Merge Require All Matching Contacts, Maximum Merges, and Perform Merge directly on the Apex Action in each Autolaunched Flow.</w:t>
+        <w:t>In production, leave Source Record Id blank so the batch processes the full eligible population. Configure Source Object Type, Contact Additional Match Fields, Contact Exclusion Criteria, Account Merge Allowed Unmatched Contact Criteria, Account Merge Require All Matching Contacts, Maximum Merges, and Perform Merge directly on the Apex Action in each Autolaunched Flow.</w:t>
       </w:r>
     </w:p>
     <w:p>
@@ -1923,7 +1989,7 @@
     <w:p>
       <w:pPr/>
       <w:r>
-        <w:t>4. Configure DHM_Account_Duplicate_Management and DHM_Contact_Duplicate_Management. Set Account Merge Require All Matching Contacts as appropriate for Account processing. For controlled testing, use Perform Merge = false and Maximum Merges = 1.</w:t>
+        <w:t>4. Configure DHM_Account_Duplicate_Management and DHM_Contact_Duplicate_Management. For Account processing, set Contact Exclusion Criteria, Account Merge Allowed Unmatched Contact Criteria, and Account Merge Require All Matching Contacts as appropriate. For controlled testing, use Perform Merge = false and Maximum Merges = 1.</w:t>
       </w:r>
     </w:p>
     <w:p>

</xml_diff>